<commit_message>
Version finale Power Apps : guide de mise en production, formules et flux finaux, Excel de déploiement, schéma ; kit HTML archivé
Co-Authored-By: Claude Opus 5.5 <noreply@anthropic.com>
Claude-Session: https://claude.ai/code/session_01FRdAzq8p3F9gJJe5MA3G79
</commit_message>
<xml_diff>
--- a/powerapps/GUIDE-PDF-APPRECIATION.docx
+++ b/powerapps/GUIDE-PDF-APPRECIATION.docx
@@ -100,6 +100,24 @@
       </w:r>
       <w:r>
         <w:t xml:space="preserve">—</w:t>
+      </w:r>
+      <w:r>
+        <w:t xml:space="preserve"> </w:t>
+      </w:r>
+      <w:r>
+        <w:t xml:space="preserve">version</w:t>
+      </w:r>
+      <w:r>
+        <w:t xml:space="preserve"> </w:t>
+      </w:r>
+      <w:r>
+        <w:t xml:space="preserve">finale</w:t>
+      </w:r>
+      <w:r>
+        <w:t xml:space="preserve"> </w:t>
+      </w:r>
+      <w:r>
+        <w:t xml:space="preserve">du</w:t>
       </w:r>
       <w:r>
         <w:t xml:space="preserve"> </w:t>
@@ -1549,7 +1567,22 @@
         <w:t xml:space="preserve">Site Appréciations</w:t>
       </w:r>
       <w:r>
-        <w:t xml:space="preserve">. Dans le bac à sable, c’est votre site SandBoxAnnieAudet.</w:t>
+        <w:t xml:space="preserve"> </w:t>
+      </w:r>
+      <w:r>
+        <w:t xml:space="preserve">(nom technique</w:t>
+      </w:r>
+      <w:r>
+        <w:t xml:space="preserve"> </w:t>
+      </w:r>
+      <w:r>
+        <w:rPr>
+          <w:rStyle w:val="VerbatimChar"/>
+        </w:rPr>
+        <w:t xml:space="preserve">rhdsst_SiteApprciations</w:t>
+      </w:r>
+      <w:r>
+        <w:t xml:space="preserve">), choisie dans le contenu dynamique. Dans le bac à sable, c’est votre site SandBoxAnnieAudet.</w:t>
       </w:r>
     </w:p>
     <w:p>
@@ -2409,6 +2442,69 @@
     <w:p>
       <w:pPr>
         <w:pStyle w:val="FirstParagraph"/>
+      </w:pPr>
+      <w:r>
+        <w:rPr>
+          <w:bCs/>
+          <w:b/>
+        </w:rPr>
+        <w:t xml:space="preserve">Si</w:t>
+      </w:r>
+      <w:r>
+        <w:rPr>
+          <w:bCs/>
+          <w:b/>
+        </w:rPr>
+        <w:t xml:space="preserve"> </w:t>
+      </w:r>
+      <w:r>
+        <w:rPr>
+          <w:rStyle w:val="VerbatimChar"/>
+          <w:bCs/>
+          <w:b/>
+        </w:rPr>
+        <w:t xml:space="preserve">.lien</w:t>
+      </w:r>
+      <w:r>
+        <w:rPr>
+          <w:bCs/>
+          <w:b/>
+        </w:rPr>
+        <w:t xml:space="preserve"> </w:t>
+      </w:r>
+      <w:r>
+        <w:rPr>
+          <w:bCs/>
+          <w:b/>
+        </w:rPr>
+        <w:t xml:space="preserve">est souligné en rouge :</w:t>
+      </w:r>
+      <w:r>
+        <w:t xml:space="preserve"> </w:t>
+      </w:r>
+      <w:r>
+        <w:t xml:space="preserve">le flux a été ajouté avant sa dernière action. Dans le volet Power Automate, faites … ›</w:t>
+      </w:r>
+      <w:r>
+        <w:t xml:space="preserve"> </w:t>
+      </w:r>
+      <w:r>
+        <w:rPr>
+          <w:bCs/>
+          <w:b/>
+        </w:rPr>
+        <w:t xml:space="preserve">Actualiser</w:t>
+      </w:r>
+      <w:r>
+        <w:t xml:space="preserve"> </w:t>
+      </w:r>
+      <w:r>
+        <w:t xml:space="preserve">sur GenererPDFAppreciation (ou retirez-le et ajoutez-le de nouveau).</w:t>
+      </w:r>
+    </w:p>
+    <w:p>
+      <w:pPr>
+        <w:pStyle w:val="BodyText"/>
       </w:pPr>
       <w:r>
         <w:rPr>

</xml_diff>

<commit_message>
Flux 3 : condition des anciennes versions par expression concat(triggerBody()?['text'], '.pdf')
Co-Authored-By: Claude Opus 5.5 <noreply@anthropic.com>
Claude-Session: https://claude.ai/code/session_01FRdAzq8p3F9gJJe5MA3G79
</commit_message>
<xml_diff>
--- a/powerapps/GUIDE-PDF-APPRECIATION.docx
+++ b/powerapps/GUIDE-PDF-APPRECIATION.docx
@@ -1474,17 +1474,7 @@
         <w:t xml:space="preserve"> </w:t>
       </w:r>
       <w:r>
-        <w:rPr>
-          <w:bCs/>
-          <w:b/>
-        </w:rPr>
-        <w:t xml:space="preserve">nomFichier</w:t>
-      </w:r>
-      <w:r>
-        <w:t xml:space="preserve"> </w:t>
-      </w:r>
-      <w:r>
-        <w:t xml:space="preserve">suivi de</w:t>
+        <w:t xml:space="preserve">l’expression (fx)</w:t>
       </w:r>
       <w:r>
         <w:t xml:space="preserve"> </w:t>
@@ -1493,7 +1483,7 @@
         <w:rPr>
           <w:rStyle w:val="VerbatimChar"/>
         </w:rPr>
-        <w:t xml:space="preserve">.pdf</w:t>
+        <w:t xml:space="preserve">concat(triggerBody()?['text'], '.pdf')</w:t>
       </w:r>
       <w:r>
         <w:t xml:space="preserve">.</w:t>

</xml_diff>